<commit_message>
Updated OpenAI niche generation with 100 high-ticket diverse niches
</commit_message>
<xml_diff>
--- a/output/websites.docx
+++ b/output/websites.docx
@@ -15,12 +15,12 @@
         <w:pStyle w:val="Heading2"/>
       </w:pPr>
       <w:r>
-        <w:t>Stay Ready To 3D Print</w:t>
+        <w:t>TaxCred Academy Scheduler</w:t>
       </w:r>
     </w:p>
     <w:p>
       <w:r>
-        <w:t>URL: https://www.stayreadyto3dprint.com/</w:t>
+        <w:t>URL: https://taxcredacademy.as.me/schedule/d9af75d6</w:t>
       </w:r>
     </w:p>
     <w:p>
@@ -35,69 +35,36 @@
     </w:p>
     <w:p>
       <w:r>
-        <w:t>Stayreadyto3dprint</w:t>
+        <w:t>Schedule Appointment with TaxCred Academy Sign Up Login TaxCred Academy FOR ALL CLASSES- E-COURSES, EVENTS, YOUTUBE CHANNEL, JOIN OUR EMAIL LIST, AND MORE!!! CLICK THIS LINK BELOW. https://plstewart.info/help The BEST WAY TO REACH ME IS BOOKING A CALL OR APPOINTMENT USING THE LINKS BELOW ON THIS PAGE. If you have any questions about the appointments or packages contact our office by phone. We would love to help! TaxCred Academy Tax Price Sheet https://plstewart.info/pricesheet Call 773-253-8668 The TaxCred Academy Team. Thanks For Your Cooperation Privacy Policy Acknowledgment By booking an appointment with TaxCred Academy, you acknowledge and agree to our Privacy Policy. We prioritize your privacy and do not share or sell your personal or opt-in mobile data information with third parties. Please review our full Privacy Policy here: Privacy Policy TaxCred Academy Terms &amp; Conditions Acknowledgment By booking an appointment or using our services, you acknowledge and agree to TaxCred Academy’s Terms and Conditions. These terms outline our services, payment policies, confidentiality practices, liability disclaimers, and dispute resolution process. Click here to view the Terms and Conditions Select Appointment Appointments for Tax Preparation &amp; Consultation Sessions 2026 Tax Preparation -Virtual In/Out of State  Appointment 1 hour You'll get a Confirmation Email to set up a Client Portal Account. We're fully digital, Please upload your forms and complete the required Intake Forms before your appointment. We will prepare the taxes and then contact you for review.  ... Show All Book 2026  Virtual Tax Prep Appointment -  Corporate/S-Corp/LLC/ NFP/ Multi Member LLC(Partnership) 2 hours @ $299.00 The $299 is ONLY A DEPOSIT. You will receive a Confirmation Email with Instructions to create a Client Portal Account. We are Officially Digital,  you can upload your forms and docs securely and easily. Book Previous Years Tax Prep 2024 and Prior - VIRTUAL 1 hour @ $199.00 A $199 deposit per tax year is required to initiate the processing of your return. Once we receive your paperwork and enter your full return, we will determine your Final Filing Fee based on the type of return required.</w:t>
         <w:br/>
-        <w:t xml:space="preserve"> – Stay Ready To 3D Print Skip to content Get An Added 10% OFF 1 Item When You Purchase a LED Upgrade Kit and TPU Mod Kit! (Must purchase both in the same order and add qualifying items. Filaments not allowed) CLICK HERE To Join Our FREE GIVEAWAYS! Go To #giveaways On Our Discord Server! New giveaways announced often! Home Shop Products Shop Products All Products Filaments LED Upgrades Creality K Series Accessories Join Social Accounts Join Social Accounts Watch on Youtube ▶️ Support on Patreon 💖 Follow on TikTok 🎵 Follow on Instagram 📸 Join us on Discord 💬 Contact Us Log in Country/region United States |</w:t>
         <w:br/>
-        <w:t xml:space="preserve">      USD</w:t>
+        <w:t>Please note: Th ... Show All Book Quick Tax Quote Call with Patrice L. Stewart 10 minutes Schedule a brief consultation with Patrice L. Stewart to receive a preliminary estimate for your tax return preparation. Please provide essential details such as your filing status and a summary of your income. Kindly email your tax for ... Show All Book Tax Inquiry Call 15 minutes @ $37.00 This is for those who have simple tax questions and want clarity on a situation. If you are not sure which service or consultation you need to move forward.</w:t>
         <w:br/>
-        <w:t xml:space="preserve">      $ Search Australia AUD</w:t>
         <w:br/>
-        <w:t xml:space="preserve">                $ Austria EUR</w:t>
+        <w:t>This call does not offer advise or strategy this is a basic call to assess you ... Show All Book Tax Consultation Review $299 1 hour @ $299.00 The session is to review your tax situation. Call the IRS, reopen tax years from audits. Amending taxes and prior years. Tax questions about state or employment or payroll taxes. This can be done by Zoom Meeting or phone call. Book Business Consulting &amp; Coaching Non Profit Filing Appointment 1 hour @ $1,795.00 Ready to launch your non-profit? This appointment covers your complete 501(c)(3) Streamlined Application filing, including:</w:t>
         <w:br/>
-        <w:t xml:space="preserve">                € Belgium EUR</w:t>
         <w:br/>
-        <w:t xml:space="preserve">                € Canada CAD</w:t>
+        <w:t>EIN – Federal Tax ID for your organization</w:t>
         <w:br/>
-        <w:t xml:space="preserve">                $ Czechia CZK</w:t>
+        <w:t xml:space="preserve">Articles of Incorporation – Non-Profit Corporation filing in your st ... Show All Book Pick My Brain Call w/ Patrice...Have Questions this is for you! 30 minutes @ $79.00 In this call you get to "Pick My Brain" for those that Love can I ask a few questions? This is the call for you!  Ask me your detailed questions, advice or clarity, and direction on topics you may believe to be unclear.  If you need mor ... Show All Book Business Pick My Brain Review Call l -30 minute Session $149 30 minutes @ $149.00 You get to Pick My Brain in this session. ​Come ready with your questions! </w:t>
         <w:br/>
-        <w:t xml:space="preserve">                Kč Denmark DKK</w:t>
         <w:br/>
-        <w:t xml:space="preserve">                kr. Finland EUR</w:t>
+        <w:t xml:space="preserve">This is a General Q A session. If you are a Start Up or Seasoned Business Owner and have questions or need clarity. This call is for you! I always say to writ ... Show All Book Business Tax Strategy Session 2 hours @ $797.00 Patrice is a Tax &amp; Business Strategist, we provide the best-personalized tax preparation and advice to growing startups, entrepreneurs, corporations, and LLCs. </w:t>
         <w:br/>
-        <w:t xml:space="preserve">                € France EUR</w:t>
         <w:br/>
-        <w:t xml:space="preserve">                € Germany EUR</w:t>
+        <w:t xml:space="preserve">In this Strategy Session, we dive deep into your business goals and object ... Show All Book Limited Time Offer ❗❗ ENTREPRENEUR STARTER PACKAGE ❗❗ 30 minutes @ $749.00 ON SALE - From $997 to $749 - Limited Time Offer </w:t>
         <w:br/>
-        <w:t xml:space="preserve">                € Hong Kong SAR HKD</w:t>
         <w:br/>
-        <w:t xml:space="preserve">                $ Ireland EUR</w:t>
+        <w:t>This starter package includes.....</w:t>
         <w:br/>
-        <w:t xml:space="preserve">                € Israel ILS</w:t>
         <w:br/>
-        <w:t xml:space="preserve">                ₪ Italy EUR</w:t>
+        <w:t>Preliminary Research (Corp/LLC Name Research and results)</w:t>
         <w:br/>
-        <w:t xml:space="preserve">                € Japan JPY</w:t>
         <w:br/>
-        <w:t xml:space="preserve">                ¥ Malaysia MYR</w:t>
+        <w:t xml:space="preserve">Preliminary Research for Trade Mark Filing (research and results) </w:t>
         <w:br/>
-        <w:t xml:space="preserve">                RM Netherlands EUR</w:t>
         <w:br/>
-        <w:t xml:space="preserve">                € New Zealand NZD</w:t>
-        <w:br/>
-        <w:t xml:space="preserve">                $ Norway USD</w:t>
-        <w:br/>
-        <w:t xml:space="preserve">                $ Poland PLN</w:t>
-        <w:br/>
-        <w:t xml:space="preserve">                zł Portugal EUR</w:t>
-        <w:br/>
-        <w:t xml:space="preserve">                € Singapore SGD</w:t>
-        <w:br/>
-        <w:t xml:space="preserve">                $ South Korea KRW</w:t>
-        <w:br/>
-        <w:t xml:space="preserve">                ₩ Spain EUR</w:t>
-        <w:br/>
-        <w:t xml:space="preserve">                € Sweden SEK</w:t>
-        <w:br/>
-        <w:t xml:space="preserve">                kr Switzerland CHF</w:t>
-        <w:br/>
-        <w:t xml:space="preserve">                CHF United Arab Emirates AED</w:t>
-        <w:br/>
-        <w:t xml:space="preserve">                د.إ United Kingdom GBP</w:t>
-        <w:br/>
-        <w:t xml:space="preserve">                £ United States USD</w:t>
-        <w:br/>
-        <w:t xml:space="preserve">                $ Home Shop Products All Products Filaments LED Upgrades Creality K Series Accessories Join Social Accounts Watch on Youtube ▶️ Support on Patreon 💖 Follow on TikTok 🎵 Follow on Instagram 📸 Join us on Discord 💬 Contact Us Search Log in Cart Item added to your cart View cart Check out Continue shopping Handmade In The USA Dramatically Improves Timelapse Imaging BROWSE PRODUCTS Every Kit Tested Before Shipping See Your Prints Clearly Even With Door Closed BROWSE PRODUCTS High Heat Durability Designed For K-Series Printers No Interference With Built-in Camera BROWSE PRODUCTS 1 / of 2 Discover the Magic of 3D Printing Come check out the fastest-growing 3D printing channel on YouTube! From beginner tips to advanced prints, we showcase stunning creations, helpful tutorials, and everything in between. Whether you're a hobbyist or a pro, there’s something here for everyone who’s ready to level up their printing game. ▶️ Watch Now on YouTube 💬 Join Us on Discord BEST SELLING PRODUCTS Over 2,500 K-Series Kits Sold! On SALE Now! Dont buy the cheap knock-offs! Our kits have stood the test of time. With over 2,500 sold , we have the best quality lights that will not peel away, they wont flicker, easy to install, no tools required , and they are COB LED's which are alot higher quality lights than your standard diode LED. COB lighting puts off alot smoother light, and last longer! All handmade &amp; tested at the Stay Ready To 3D Print Studio. Creality K-Series LED Light Upgrade Kit Sale Creality K-Series LED Light Upgrade Kit Regular price $19.99 USD Regular price $24.99 USD Sale price $19.99 USD Unit price / per Sale ▶️ Watch on YouTube 💖 Support on Patreon 🎵 Follow on TikTok 📸 Follow on Instagram 💬 Join us on Discord Enter Your Email For A Chance To Win A 3D Printer! Email Payment methods Amazon American Express Apple Pay Bancontact Diners Club Discover Google Pay iDEAL Mastercard Shop Pay Visa © 2026, Stay Ready To 3D Print Powered by Shopify Privacy policy Refund policy Terms of service Shipping policy Contact information Choosing a selection results in a full page refresh. Opens in a new window.</w:t>
+        <w:t>Filing Your Corporatio ... Show All Book</w:t>
       </w:r>
     </w:p>
     <w:sectPr>

</xml_diff>

<commit_message>
Added Emails Pending sheet to global deduplication
</commit_message>
<xml_diff>
--- a/output/websites.docx
+++ b/output/websites.docx
@@ -15,12 +15,12 @@
         <w:pStyle w:val="Heading2"/>
       </w:pPr>
       <w:r>
-        <w:t>TaxCred Academy Scheduler</w:t>
+        <w:t>Nutri-Tech Courses</w:t>
       </w:r>
     </w:p>
     <w:p>
       <w:r>
-        <w:t>URL: https://taxcredacademy.as.me/schedule/d9af75d6</w:t>
+        <w:t>URL: https://nutri-tech.com.au/pages/courses</w:t>
       </w:r>
     </w:p>
     <w:p>
@@ -35,36 +35,43 @@
     </w:p>
     <w:p>
       <w:r>
-        <w:t>Schedule Appointment with TaxCred Academy Sign Up Login TaxCred Academy FOR ALL CLASSES- E-COURSES, EVENTS, YOUTUBE CHANNEL, JOIN OUR EMAIL LIST, AND MORE!!! CLICK THIS LINK BELOW. https://plstewart.info/help The BEST WAY TO REACH ME IS BOOKING A CALL OR APPOINTMENT USING THE LINKS BELOW ON THIS PAGE. If you have any questions about the appointments or packages contact our office by phone. We would love to help! TaxCred Academy Tax Price Sheet https://plstewart.info/pricesheet Call 773-253-8668 The TaxCred Academy Team. Thanks For Your Cooperation Privacy Policy Acknowledgment By booking an appointment with TaxCred Academy, you acknowledge and agree to our Privacy Policy. We prioritize your privacy and do not share or sell your personal or opt-in mobile data information with third parties. Please review our full Privacy Policy here: Privacy Policy TaxCred Academy Terms &amp; Conditions Acknowledgment By booking an appointment or using our services, you acknowledge and agree to TaxCred Academy’s Terms and Conditions. These terms outline our services, payment policies, confidentiality practices, liability disclaimers, and dispute resolution process. Click here to view the Terms and Conditions Select Appointment Appointments for Tax Preparation &amp; Consultation Sessions 2026 Tax Preparation -Virtual In/Out of State  Appointment 1 hour You'll get a Confirmation Email to set up a Client Portal Account. We're fully digital, Please upload your forms and complete the required Intake Forms before your appointment. We will prepare the taxes and then contact you for review.  ... Show All Book 2026  Virtual Tax Prep Appointment -  Corporate/S-Corp/LLC/ NFP/ Multi Member LLC(Partnership) 2 hours @ $299.00 The $299 is ONLY A DEPOSIT. You will receive a Confirmation Email with Instructions to create a Client Portal Account. We are Officially Digital,  you can upload your forms and docs securely and easily. Book Previous Years Tax Prep 2024 and Prior - VIRTUAL 1 hour @ $199.00 A $199 deposit per tax year is required to initiate the processing of your return. Once we receive your paperwork and enter your full return, we will determine your Final Filing Fee based on the type of return required.</w:t>
+        <w:t>Courses</w:t>
         <w:br/>
+        <w:t>– Nutri-Tech Solutions Pty Ltd Skip to content Pause slideshow Play slideshow Certificate in Nutrition Farming® – March 2026: Monday 23rd  - 27th Secure your position for the Certificate in Nutrition Farming® – March 2026: Monday 23rd  - 27th . . . Site navigation Nutri-Tech Solutions Pty Ltd Search Search Search Account 0 Cart . . . Site navigation Close Search Search Cancel ABOUT PRODUCTS AGRICULTURE Animal Health Bio-Management Dry Mineral Fertilisers Humates Liquid Fertilisers Micronised Minerals Microbes Microbe Culturing Monitoring Meters Organic Certified Input List HOME GARDEN Life Force® Home Garden Range HUMAN HEALTH NUTRITION FARMS SERVICES SOIL &amp; PLANT THERAPY™ CONSULT WITH GRAEME SAIT CONTACT AN AGRONOMIST GET A FREE E-BOOK BLOG - ARTICLES COURSES PODCAST EVENTS CONTACT Get in touch Join Our Sales Network Search Search Goes great with Quick shop Add to cart 100 Micron Compost Tea Bag $61 75 $61.75 "Close (esc)" Quick shop Add to cart Activated Char Condensate (ACC)™ from $23 65 from $23.65 "Close (esc)" Quick shop Add to cart Air Pump Aerator for Brew Kits $73 10 $73.10 "Close (esc)" Quick shop Add to cart Air Stones and Pipes Set $7 75 $7.75 "Close (esc)" Add order note Close Subtotal $0 00 Check out Shipping, taxes, and discount codes calculated at checkout. Your cart is currently empty. ABOUT icon-chevron PRODUCTS icon-chevron Expand submenu PRODUCTS AGRICULTURE icon-chevron Expand submenu AGRICULTURE Animal Health icon-chevron Bio-Management icon-chevron Dry Mineral Fertilisers icon-chevron Humates icon-chevron Liquid Fertilisers icon-chevron Micronised Minerals icon-chevron Microbes icon-chevron Microbe Culturing icon-chevron Monitoring Meters icon-chevron Organic Certified Input List icon-chevron HOME GARDEN icon-chevron Expand submenu HOME GARDEN Life Force® Home Garden Range icon-chevron HUMAN HEALTH icon-chevron NUTRITION FARMS icon-chevron SERVICES icon-chevron Expand submenu SERVICES SOIL &amp; PLANT THERAPY™ icon-chevron CONSULT WITH GRAEME SAIT icon-chevron CONTACT AN AGRONOMIST icon-chevron GET A FREE E-BOOK icon-chevron BLOG - ARTICLES icon-chevron COURSES icon-chevron PODCAST icon-chevron EVENTS icon-chevron CONTACT icon-chevron Expand submenu CONTACT Get in touch icon-chevron Join Our Sales Network icon-chevron Certificate in Nutrition Farming® Knowledge is empowerment – this leading sustainable agriculture course has enlightened thousands of trainees globally over 20 years. Book Now Transform your farming. The Certificate in Nutrition Farming®is essential training for food producers seeking a more profitable, productive and regenerative approach to farming. This internationally respected course teaches innovative, cutting-edge strategies to improve the health of your farm, your garden, your planet and yourself. Countless agriculturalists, advisors, healthcare providers, and domestic food cultivators across the globe have reaped substantial rewards from this rigorous educational program. This includes globally renowned entities such as The Dole Corporation, the world's leading food producer; Lộc Trời Group, the titans of Vietnam's agricultural industry; and Woolworths, with their extensive network of 540 supermarkets across South Africa. Upon finishing this intensive training and successfully passing the requisite examinations, participants are awarded a certificate. This globally recognised certification significantly enhances any professional profile, providing a competitive edge in job markets worldwide. Secure Your Seat. Elevate your farming techniques, supercharge your crop health, meet like-minded people and boost the nutrition of your produce with our upcoming course in Yandina, QLD, Australia . Hurry, seats are filling fast. 4 DAYS 6 HOURS 13 MINUTES 40 SECONDS Learn More &amp; Book Your Position Comments from Previous Attendees “Graeme this has been the most inspirational week of my life. You are so unbelievably knowledgeable and we are so fortunate to come here to share it all. Your whole team has been so very helpful and I would like to thank you all so much.” Margery “It was the most beneficial, fantastic setting and the information, food, atmosphere was brilliant. I will definitely recommend this course to other growers, people I know. It was truly enlightening. Looking forward to putting all I have learned to practice – watch this space grow.” Malcolm Leadbetter “This has been such a positive week. It has reaffirmed many of my thoughts about how we should farm. This was an amazing and inspiring week. Thank you.” Dale Creed “Great work guys. Such informative and passionate presentations. It was thoroughly enjoyable and inspiring throughout. This has changed my views on so many aspects of how I approach both agriculture and my own health.” Casey White “Graeme – I would like to thank you from the bottom of my heart for the knowledge, energy and power you have so graciously and unselfishly passed on to all of us.” Jason Reimers “This course took my disjointed understanding of concepts of plant theory and biological farming and gave me a new understanding and excitement.” Ian Lindsay “A brilliant relevant course that everyone should attend to take control of their health and livelihood.” Clayton Farmer “Thanks Graeme, I really appreciate the message that you are passionately putting out there. Let us work together for a better future, the only way forward!” Marco Bazzanella “Enjoyed the team's relaxed attitude and Graeme's humour and energy. Graeme's anecdotes are just as valuable as the course content – don't stop.” Roger Martyn Trusted by Leading Organisations Dive into Strategies for Profitable, Regenerative Farming – And Much More The Certificate in Nutrition Farming® involves a 300-page manual and five online exams covering Mineral Management, Microbe Management, Plant Management, Pest Management and Human Health Management. More Information and Course Bookings Nutrition Matters Sign up to our popular newsletter and receive a FREE E-BOOK. We deliver the latest news in soil &amp; crop nutrition, animal and human health. Join the thousands of farmers who benefit from this essential publication. Quick Links Our Mission Newsletter Jobs Your Closest Distributor Become an NTS Distributor Shipping Policy Contact Us Get in touch +61 7 54729900 Email us Follow us instagram Instagram Facebook LinkedIn We accept Apple Pay Google Pay Mastercard PayPal Shop Pay Union Pay Visa © 2026</w:t>
         <w:br/>
-        <w:t>Please note: Th ... Show All Book Quick Tax Quote Call with Patrice L. Stewart 10 minutes Schedule a brief consultation with Patrice L. Stewart to receive a preliminary estimate for your tax return preparation. Please provide essential details such as your filing status and a summary of your income. Kindly email your tax for ... Show All Book Tax Inquiry Call 15 minutes @ $37.00 This is for those who have simple tax questions and want clarity on a situation. If you are not sure which service or consultation you need to move forward.</w:t>
+        <w:t xml:space="preserve">            Nutri-Tech Solutions Pty Ltd Privacy Policy Terms of Service "Close (esc)" icon-chevron "Close (esc)" Courses</w:t>
+      </w:r>
+    </w:p>
+    <w:p>
+      <w:pPr>
+        <w:pStyle w:val="Heading2"/>
+      </w:pPr>
+      <w:r>
+        <w:t>Nutri-Tech Main</w:t>
+      </w:r>
+    </w:p>
+    <w:p>
+      <w:r>
+        <w:t>URL: https://nutri-tech.com.au/</w:t>
+      </w:r>
+    </w:p>
+    <w:p>
+      <w:r>
+        <w:t>Scraping method: playwright</w:t>
+      </w:r>
+    </w:p>
+    <w:p>
+      <w:r>
         <w:br/>
+      </w:r>
+    </w:p>
+    <w:p>
+      <w:r>
+        <w:t>Nutri-Tech Solutions | Fertilisers &amp; Advanced Crop Health</w:t>
         <w:br/>
-        <w:t>This call does not offer advise or strategy this is a basic call to assess you ... Show All Book Tax Consultation Review $299 1 hour @ $299.00 The session is to review your tax situation. Call the IRS, reopen tax years from audits. Amending taxes and prior years. Tax questions about state or employment or payroll taxes. This can be done by Zoom Meeting or phone call. Book Business Consulting &amp; Coaching Non Profit Filing Appointment 1 hour @ $1,795.00 Ready to launch your non-profit? This appointment covers your complete 501(c)(3) Streamlined Application filing, including:</w:t>
+        <w:t>– Nutri-Tech Solutions Pty Ltd Skip to content Pause slideshow Play slideshow Certificate in Nutrition Farming® – March 2026: Monday 23rd  - 27th Secure your position for the Certificate in Nutrition Farming® – March 2026: Monday 23rd  - 27th . . . Site navigation Nutri-Tech Solutions Pty Ltd Search Search Search Account 0 Cart . . . Site navigation Close Search Search Cancel ABOUT PRODUCTS AGRICULTURE Animal Health Bio-Management Dry Mineral Fertilisers Humates Liquid Fertilisers Micronised Minerals Microbes Microbe Culturing Monitoring Meters Organic Certified Input List HOME GARDEN Life Force® Home Garden Range HUMAN HEALTH NUTRITION FARMS SERVICES SOIL &amp; PLANT THERAPY™ CONSULT WITH GRAEME SAIT CONTACT AN AGRONOMIST GET A FREE E-BOOK BLOG - ARTICLES COURSES PODCAST EVENTS CONTACT Get in touch Join Our Sales Network Search Search Goes great with Quick shop Add to cart 100 Micron Compost Tea Bag $61 75 $61.75 "Close (esc)" Quick shop Add to cart Activated Char Condensate (ACC)™ from $23 65 from $23.65 "Close (esc)" Quick shop Add to cart Air Pump Aerator for Brew Kits $73 10 $73.10 "Close (esc)" Quick shop Add to cart Air Stones and Pipes Set $7 75 $7.75 "Close (esc)" Add order note Close Subtotal $0 00 Check out Shipping, taxes, and discount codes calculated at checkout. Your cart is currently empty. ABOUT icon-chevron PRODUCTS icon-chevron Expand submenu PRODUCTS AGRICULTURE icon-chevron Expand submenu AGRICULTURE Animal Health icon-chevron Bio-Management icon-chevron Dry Mineral Fertilisers icon-chevron Humates icon-chevron Liquid Fertilisers icon-chevron Micronised Minerals icon-chevron Microbes icon-chevron Microbe Culturing icon-chevron Monitoring Meters icon-chevron Organic Certified Input List icon-chevron HOME GARDEN icon-chevron Expand submenu HOME GARDEN Life Force® Home Garden Range icon-chevron HUMAN HEALTH icon-chevron NUTRITION FARMS icon-chevron SERVICES icon-chevron Expand submenu SERVICES SOIL &amp; PLANT THERAPY™ icon-chevron CONSULT WITH GRAEME SAIT icon-chevron CONTACT AN AGRONOMIST icon-chevron GET A FREE E-BOOK icon-chevron BLOG - ARTICLES icon-chevron COURSES icon-chevron PODCAST icon-chevron EVENTS icon-chevron CONTACT icon-chevron Expand submenu CONTACT Get in touch icon-chevron Join Our Sales Network icon-chevron Pioneers in Nutrition Farming® Let's work together to maximise your profit while improving your sustainability. Soil Health is Your Wealth. NTS are world leaders in regenerative agriculture. We have developed a groundbreaking system which slashes chemical reliance, rejuvenates soil, boosts plant vitality, and elevates human health. We work with farmers to create more profitable, productive farming enterprises across the globe. News/Articles Discover 'Nutrition Matters' – our rich library filled with easy-to-understand articles about regenerative agriculture and innovative farming methods. Read Now Podcast Catch the 'Nutrition Farming Podcast' with Graeme Sait – Your destination for industry expert interviews, fresh farming perspectives &amp; much more. Listen Now Courses The Certificate in Nutrition Farming® has enlightened thousands of trainees globally for over 20 years. Learn more now. Next Course Dates This Month's Best Sellers View all Quick shop Add to cart Triple Ten™ from $30 85 from $30.85 "Close (esc)" Quick shop Add to cart Trio (CMB)™ from $53 55 from $53.55 "Close (esc)" Quick shop Add to cart Tri-Kelp™ from $43 20 from $43.20 "Close (esc)" Quick shop Add to cart Nutri-Life Tricho-Shield™ from $20 55 from $20.55 "Close (esc)" Quick shop Add to cart Nutri-Life BAM™ from $13 35 from $13.35 "Close (esc)" Innovators in Regenerative Agriculture. We're committed to boosting farm profitability through pioneering nutrition strategies and a diverse range of over 200 innovative products, including the world's most extensive range of organically certified inputs.  Our influence spans 50 countries, equipping farmers with our transformative Nutrition Farming® training and ground-breaking Soil Therapy™ and Plant Therapy™ services. Join us to enrich your soil, yield higher quality crops and contribute to global environmental sustainability. Trusted by Leading Organisations Nutrition Matters Sign up to our popular newsletter and receive a FREE E-BOOK. We deliver the latest news in soil &amp; crop nutrition, animal and human health. Join the thousands of farmers who benefit from this essential publication. Quick Links Our Mission Newsletter Jobs Your Closest Distributor Become an NTS Distributor Shipping Policy Contact Us Get in touch +61 7 54729900 Email us Follow us instagram Instagram Facebook LinkedIn We accept Apple Pay Google Pay Mastercard PayPal Shop Pay Union Pay Visa © 2026</w:t>
         <w:br/>
-        <w:br/>
-        <w:t>EIN – Federal Tax ID for your organization</w:t>
-        <w:br/>
-        <w:t xml:space="preserve">Articles of Incorporation – Non-Profit Corporation filing in your st ... Show All Book Pick My Brain Call w/ Patrice...Have Questions this is for you! 30 minutes @ $79.00 In this call you get to "Pick My Brain" for those that Love can I ask a few questions? This is the call for you!  Ask me your detailed questions, advice or clarity, and direction on topics you may believe to be unclear.  If you need mor ... Show All Book Business Pick My Brain Review Call l -30 minute Session $149 30 minutes @ $149.00 You get to Pick My Brain in this session. ​Come ready with your questions! </w:t>
-        <w:br/>
-        <w:br/>
-        <w:t xml:space="preserve">This is a General Q A session. If you are a Start Up or Seasoned Business Owner and have questions or need clarity. This call is for you! I always say to writ ... Show All Book Business Tax Strategy Session 2 hours @ $797.00 Patrice is a Tax &amp; Business Strategist, we provide the best-personalized tax preparation and advice to growing startups, entrepreneurs, corporations, and LLCs. </w:t>
-        <w:br/>
-        <w:br/>
-        <w:t xml:space="preserve">In this Strategy Session, we dive deep into your business goals and object ... Show All Book Limited Time Offer ❗❗ ENTREPRENEUR STARTER PACKAGE ❗❗ 30 minutes @ $749.00 ON SALE - From $997 to $749 - Limited Time Offer </w:t>
-        <w:br/>
-        <w:br/>
-        <w:t>This starter package includes.....</w:t>
-        <w:br/>
-        <w:br/>
-        <w:t>Preliminary Research (Corp/LLC Name Research and results)</w:t>
-        <w:br/>
-        <w:br/>
-        <w:t xml:space="preserve">Preliminary Research for Trade Mark Filing (research and results) </w:t>
-        <w:br/>
-        <w:br/>
-        <w:t>Filing Your Corporatio ... Show All Book</w:t>
+        <w:t xml:space="preserve">            Nutri-Tech Solutions Pty Ltd Privacy Policy Terms of Service "Close (esc)" icon-chevron "Close (esc)" Nutri-Tech Solutions | Fertilisers &amp; Advanced Crop Health</w:t>
       </w:r>
     </w:p>
     <w:sectPr>

</xml_diff>

<commit_message>
Refreshed niche generation with new adjacent high-ticket niches
</commit_message>
<xml_diff>
--- a/output/websites.docx
+++ b/output/websites.docx
@@ -15,12 +15,12 @@
         <w:pStyle w:val="Heading2"/>
       </w:pPr>
       <w:r>
-        <w:t>Nutri-Tech Courses</w:t>
+        <w:t>EJS Golf</w:t>
       </w:r>
     </w:p>
     <w:p>
       <w:r>
-        <w:t>URL: https://nutri-tech.com.au/pages/courses</w:t>
+        <w:t>URL: https://ejsgolf.com/</w:t>
       </w:r>
     </w:p>
     <w:p>
@@ -35,43 +35,7 @@
     </w:p>
     <w:p>
       <w:r>
-        <w:t>Courses</w:t>
-        <w:br/>
-        <w:t>– Nutri-Tech Solutions Pty Ltd Skip to content Pause slideshow Play slideshow Certificate in Nutrition Farming® – March 2026: Monday 23rd  - 27th Secure your position for the Certificate in Nutrition Farming® – March 2026: Monday 23rd  - 27th . . . Site navigation Nutri-Tech Solutions Pty Ltd Search Search Search Account 0 Cart . . . Site navigation Close Search Search Cancel ABOUT PRODUCTS AGRICULTURE Animal Health Bio-Management Dry Mineral Fertilisers Humates Liquid Fertilisers Micronised Minerals Microbes Microbe Culturing Monitoring Meters Organic Certified Input List HOME GARDEN Life Force® Home Garden Range HUMAN HEALTH NUTRITION FARMS SERVICES SOIL &amp; PLANT THERAPY™ CONSULT WITH GRAEME SAIT CONTACT AN AGRONOMIST GET A FREE E-BOOK BLOG - ARTICLES COURSES PODCAST EVENTS CONTACT Get in touch Join Our Sales Network Search Search Goes great with Quick shop Add to cart 100 Micron Compost Tea Bag $61 75 $61.75 "Close (esc)" Quick shop Add to cart Activated Char Condensate (ACC)™ from $23 65 from $23.65 "Close (esc)" Quick shop Add to cart Air Pump Aerator for Brew Kits $73 10 $73.10 "Close (esc)" Quick shop Add to cart Air Stones and Pipes Set $7 75 $7.75 "Close (esc)" Add order note Close Subtotal $0 00 Check out Shipping, taxes, and discount codes calculated at checkout. Your cart is currently empty. ABOUT icon-chevron PRODUCTS icon-chevron Expand submenu PRODUCTS AGRICULTURE icon-chevron Expand submenu AGRICULTURE Animal Health icon-chevron Bio-Management icon-chevron Dry Mineral Fertilisers icon-chevron Humates icon-chevron Liquid Fertilisers icon-chevron Micronised Minerals icon-chevron Microbes icon-chevron Microbe Culturing icon-chevron Monitoring Meters icon-chevron Organic Certified Input List icon-chevron HOME GARDEN icon-chevron Expand submenu HOME GARDEN Life Force® Home Garden Range icon-chevron HUMAN HEALTH icon-chevron NUTRITION FARMS icon-chevron SERVICES icon-chevron Expand submenu SERVICES SOIL &amp; PLANT THERAPY™ icon-chevron CONSULT WITH GRAEME SAIT icon-chevron CONTACT AN AGRONOMIST icon-chevron GET A FREE E-BOOK icon-chevron BLOG - ARTICLES icon-chevron COURSES icon-chevron PODCAST icon-chevron EVENTS icon-chevron CONTACT icon-chevron Expand submenu CONTACT Get in touch icon-chevron Join Our Sales Network icon-chevron Certificate in Nutrition Farming® Knowledge is empowerment – this leading sustainable agriculture course has enlightened thousands of trainees globally over 20 years. Book Now Transform your farming. The Certificate in Nutrition Farming®is essential training for food producers seeking a more profitable, productive and regenerative approach to farming. This internationally respected course teaches innovative, cutting-edge strategies to improve the health of your farm, your garden, your planet and yourself. Countless agriculturalists, advisors, healthcare providers, and domestic food cultivators across the globe have reaped substantial rewards from this rigorous educational program. This includes globally renowned entities such as The Dole Corporation, the world's leading food producer; Lộc Trời Group, the titans of Vietnam's agricultural industry; and Woolworths, with their extensive network of 540 supermarkets across South Africa. Upon finishing this intensive training and successfully passing the requisite examinations, participants are awarded a certificate. This globally recognised certification significantly enhances any professional profile, providing a competitive edge in job markets worldwide. Secure Your Seat. Elevate your farming techniques, supercharge your crop health, meet like-minded people and boost the nutrition of your produce with our upcoming course in Yandina, QLD, Australia . Hurry, seats are filling fast. 4 DAYS 6 HOURS 13 MINUTES 40 SECONDS Learn More &amp; Book Your Position Comments from Previous Attendees “Graeme this has been the most inspirational week of my life. You are so unbelievably knowledgeable and we are so fortunate to come here to share it all. Your whole team has been so very helpful and I would like to thank you all so much.” Margery “It was the most beneficial, fantastic setting and the information, food, atmosphere was brilliant. I will definitely recommend this course to other growers, people I know. It was truly enlightening. Looking forward to putting all I have learned to practice – watch this space grow.” Malcolm Leadbetter “This has been such a positive week. It has reaffirmed many of my thoughts about how we should farm. This was an amazing and inspiring week. Thank you.” Dale Creed “Great work guys. Such informative and passionate presentations. It was thoroughly enjoyable and inspiring throughout. This has changed my views on so many aspects of how I approach both agriculture and my own health.” Casey White “Graeme – I would like to thank you from the bottom of my heart for the knowledge, energy and power you have so graciously and unselfishly passed on to all of us.” Jason Reimers “This course took my disjointed understanding of concepts of plant theory and biological farming and gave me a new understanding and excitement.” Ian Lindsay “A brilliant relevant course that everyone should attend to take control of their health and livelihood.” Clayton Farmer “Thanks Graeme, I really appreciate the message that you are passionately putting out there. Let us work together for a better future, the only way forward!” Marco Bazzanella “Enjoyed the team's relaxed attitude and Graeme's humour and energy. Graeme's anecdotes are just as valuable as the course content – don't stop.” Roger Martyn Trusted by Leading Organisations Dive into Strategies for Profitable, Regenerative Farming – And Much More The Certificate in Nutrition Farming® involves a 300-page manual and five online exams covering Mineral Management, Microbe Management, Plant Management, Pest Management and Human Health Management. More Information and Course Bookings Nutrition Matters Sign up to our popular newsletter and receive a FREE E-BOOK. We deliver the latest news in soil &amp; crop nutrition, animal and human health. Join the thousands of farmers who benefit from this essential publication. Quick Links Our Mission Newsletter Jobs Your Closest Distributor Become an NTS Distributor Shipping Policy Contact Us Get in touch +61 7 54729900 Email us Follow us instagram Instagram Facebook LinkedIn We accept Apple Pay Google Pay Mastercard PayPal Shop Pay Union Pay Visa © 2026</w:t>
-        <w:br/>
-        <w:t xml:space="preserve">            Nutri-Tech Solutions Pty Ltd Privacy Policy Terms of Service "Close (esc)" icon-chevron "Close (esc)" Courses</w:t>
-      </w:r>
-    </w:p>
-    <w:p>
-      <w:pPr>
-        <w:pStyle w:val="Heading2"/>
-      </w:pPr>
-      <w:r>
-        <w:t>Nutri-Tech Main</w:t>
-      </w:r>
-    </w:p>
-    <w:p>
-      <w:r>
-        <w:t>URL: https://nutri-tech.com.au/</w:t>
-      </w:r>
-    </w:p>
-    <w:p>
-      <w:r>
-        <w:t>Scraping method: playwright</w:t>
-      </w:r>
-    </w:p>
-    <w:p>
-      <w:r>
-        <w:br/>
-      </w:r>
-    </w:p>
-    <w:p>
-      <w:r>
-        <w:t>Nutri-Tech Solutions | Fertilisers &amp; Advanced Crop Health</w:t>
-        <w:br/>
-        <w:t>– Nutri-Tech Solutions Pty Ltd Skip to content Pause slideshow Play slideshow Certificate in Nutrition Farming® – March 2026: Monday 23rd  - 27th Secure your position for the Certificate in Nutrition Farming® – March 2026: Monday 23rd  - 27th . . . Site navigation Nutri-Tech Solutions Pty Ltd Search Search Search Account 0 Cart . . . Site navigation Close Search Search Cancel ABOUT PRODUCTS AGRICULTURE Animal Health Bio-Management Dry Mineral Fertilisers Humates Liquid Fertilisers Micronised Minerals Microbes Microbe Culturing Monitoring Meters Organic Certified Input List HOME GARDEN Life Force® Home Garden Range HUMAN HEALTH NUTRITION FARMS SERVICES SOIL &amp; PLANT THERAPY™ CONSULT WITH GRAEME SAIT CONTACT AN AGRONOMIST GET A FREE E-BOOK BLOG - ARTICLES COURSES PODCAST EVENTS CONTACT Get in touch Join Our Sales Network Search Search Goes great with Quick shop Add to cart 100 Micron Compost Tea Bag $61 75 $61.75 "Close (esc)" Quick shop Add to cart Activated Char Condensate (ACC)™ from $23 65 from $23.65 "Close (esc)" Quick shop Add to cart Air Pump Aerator for Brew Kits $73 10 $73.10 "Close (esc)" Quick shop Add to cart Air Stones and Pipes Set $7 75 $7.75 "Close (esc)" Add order note Close Subtotal $0 00 Check out Shipping, taxes, and discount codes calculated at checkout. Your cart is currently empty. ABOUT icon-chevron PRODUCTS icon-chevron Expand submenu PRODUCTS AGRICULTURE icon-chevron Expand submenu AGRICULTURE Animal Health icon-chevron Bio-Management icon-chevron Dry Mineral Fertilisers icon-chevron Humates icon-chevron Liquid Fertilisers icon-chevron Micronised Minerals icon-chevron Microbes icon-chevron Microbe Culturing icon-chevron Monitoring Meters icon-chevron Organic Certified Input List icon-chevron HOME GARDEN icon-chevron Expand submenu HOME GARDEN Life Force® Home Garden Range icon-chevron HUMAN HEALTH icon-chevron NUTRITION FARMS icon-chevron SERVICES icon-chevron Expand submenu SERVICES SOIL &amp; PLANT THERAPY™ icon-chevron CONSULT WITH GRAEME SAIT icon-chevron CONTACT AN AGRONOMIST icon-chevron GET A FREE E-BOOK icon-chevron BLOG - ARTICLES icon-chevron COURSES icon-chevron PODCAST icon-chevron EVENTS icon-chevron CONTACT icon-chevron Expand submenu CONTACT Get in touch icon-chevron Join Our Sales Network icon-chevron Pioneers in Nutrition Farming® Let's work together to maximise your profit while improving your sustainability. Soil Health is Your Wealth. NTS are world leaders in regenerative agriculture. We have developed a groundbreaking system which slashes chemical reliance, rejuvenates soil, boosts plant vitality, and elevates human health. We work with farmers to create more profitable, productive farming enterprises across the globe. News/Articles Discover 'Nutrition Matters' – our rich library filled with easy-to-understand articles about regenerative agriculture and innovative farming methods. Read Now Podcast Catch the 'Nutrition Farming Podcast' with Graeme Sait – Your destination for industry expert interviews, fresh farming perspectives &amp; much more. Listen Now Courses The Certificate in Nutrition Farming® has enlightened thousands of trainees globally for over 20 years. Learn more now. Next Course Dates This Month's Best Sellers View all Quick shop Add to cart Triple Ten™ from $30 85 from $30.85 "Close (esc)" Quick shop Add to cart Trio (CMB)™ from $53 55 from $53.55 "Close (esc)" Quick shop Add to cart Tri-Kelp™ from $43 20 from $43.20 "Close (esc)" Quick shop Add to cart Nutri-Life Tricho-Shield™ from $20 55 from $20.55 "Close (esc)" Quick shop Add to cart Nutri-Life BAM™ from $13 35 from $13.35 "Close (esc)" Innovators in Regenerative Agriculture. We're committed to boosting farm profitability through pioneering nutrition strategies and a diverse range of over 200 innovative products, including the world's most extensive range of organically certified inputs.  Our influence spans 50 countries, equipping farmers with our transformative Nutrition Farming® training and ground-breaking Soil Therapy™ and Plant Therapy™ services. Join us to enrich your soil, yield higher quality crops and contribute to global environmental sustainability. Trusted by Leading Organisations Nutrition Matters Sign up to our popular newsletter and receive a FREE E-BOOK. We deliver the latest news in soil &amp; crop nutrition, animal and human health. Join the thousands of farmers who benefit from this essential publication. Quick Links Our Mission Newsletter Jobs Your Closest Distributor Become an NTS Distributor Shipping Policy Contact Us Get in touch +61 7 54729900 Email us Follow us instagram Instagram Facebook LinkedIn We accept Apple Pay Google Pay Mastercard PayPal Shop Pay Union Pay Visa © 2026</w:t>
-        <w:br/>
-        <w:t xml:space="preserve">            Nutri-Tech Solutions Pty Ltd Privacy Policy Terms of Service "Close (esc)" icon-chevron "Close (esc)" Nutri-Tech Solutions | Fertilisers &amp; Advanced Crop Health</w:t>
+        <w:t>Scottsdale Golf Lessons | Data-Driven Golf Instruction | EJS Golf Scottsdale Golf Lessons | Data-Driven Golf Instruction | EJS Golf Golf Lessons Scottsdale Golf Lessons Online Golf Lessons Free Phone Consultation About SBG Community Blog More Contact Me Gear 15 - Minutes Practice Guide Gift Certificates Technology Swingyard.com Book Intro Lesson Elevate Your Golf Game In 2026 Scottsdale's #1 Rated Golf Instructor Book Intro Lesson Scottsdale Golf Lessons Schedule a golf lesson with Coach Erik at his teaching bay at the back of the range at McCormick Ranch Golf Club. Coach Erik offers individual, partner, group, junior, and playing lessons. Learn More Scottsdale Golf Lessons Schedule a golf lesson with Coach Erik at his teaching bay at the back of the range at McCormick Ranch Golf Club. Coach Erik offers individual, partner, group, junior, and playing lessons. Learn More Online Lessons If you don't live in Scottsdale, AZ or don't have availability during daylight hours for a lesson in person, online lessons are a good fit for you. We're no longer limited by distance. Learn More Online Lessons If you don't live in Scottsdale, AZ or don't have availability during daylight hours for a lesson in person, online lessons are a good fit for you. We're no longer limited by distance. Learn More EJS GOLF - GET BETTER NOW Why Choose Coach Erik? Rapid Improvement Philosophy Get Better From Day One Experience and Expertise Focus On Biomechanics and Learning Accessibility and Flexibility Customized Feedback-Driven Approach BOOK INTRO NOW Listen to one student's experience with Coach Erik... PREMIUM GOLF INSTRUCTION MAKING YOU A BETTER GOLFER! "My goal for every golfer is to eventually have them become their own best golf coach. Imagine being in control of your swing faults, ball flight issues, and how to fix them!" -Erik Schjolberg, EJS Golf Academy Phone: 480.861.9370 Email: erik@ejsgolf.com WHAT STUDENTS ARE SAYING... #1 Rated Coach by Golfers Who... Play Competitively EJS Golf Academy in Scottsdale is the go-to place for competitive golfers aiming for the top. My elite coaching with Scottsdale Golf Lessons , caters to juniors, collegiate athletes, and professionals. I focus on getting each golfer to the next level they want to achieve. I work with the parents of juniors and college golfers to get everyone on the same page so that the same message is used all the time. There is no greater honor for me than helping a junior into the college of their dreams. Offering both Golf Lessons Scottsdale and Online Golf Lessons , I provide the tools and training necessary for you to excel in competitive golf . Reached a Plateau Do you feel stuck ? Still hitting golf shots you don't like ? For golfers experiencing a plateau, you are ready for my breakthrough solutions . My Scottsdale Golf Lessons and o nline golf lessons are tailored to identify and overcome your specific challenges. I want to give you the tools you need to move past your plateau . Using advanced techniques and tools like the Trackman 4, Dual 3D Pressure Plates, 3D Video and much more I provide targeted coaching to refine your skills. We'll work together to get you through the challenges you are facing. A High Handicap At EJS Golf in Scottsdale AZ, coach Erik specializes in transforming high handicappers into confident golfers that shoot much lower scores. Coach Erik focuses on building consistency into your game by teaching you how to consistently strike the golf ball first. This means no more topped golf shots, no more fat golf shots. With my state-of-the-art technology and personalized approach, I ensure that every golfer that comes to see me improves. YOU DO NOT NEED TO GET WORSE BEFORE YOU GET BETTER! FAQS What Sets EJS Golf Apart in Offering Scottsdale Golf Lessons? EJS Golf Academy, located at McCormick Ranch Golf Club in Scottsdale, AZ , is renowned for its ability to make golfers better from day one. Led by Coach Erik, a seasoned instructor with PGA Tour coaching experience, guarantees your results. How do EJS Golf's Online Golf Lessons differ from traditional coaching? Online Golf Lessons with Coach Erik of EJS Golf allows golfers from all over the world to work with Scottsdale's Top golf coach. Using the latest tech, including 3D mapping, be like Matt R. and drop your handicap from 15 to a 6 in one year. Find out what PGA Tour Professionals know about coach Erik wherever you are. Are the Golf Lessons Near Me at EJS Golf Suitable for all Skill Levels? Absolutely! Whether you're a beginner or an advanced player, EJS Golf provides lessons tailored to your skill level. My approach is rooted in biomechanics and modern teaching techniques, making us the no. 1 choice for golfers seeking the best golf instruction in AZ. Why is Coach Erik Considered Among the Best Golf Instructors in AZ? Coach Erik's extensive experience, including over 25 years of professional golf coaching, PGA Tour player mentoring, voted no. 1 by those that take golf lessons in Scottsdale and online golf lessons position him as one of the best golf instructors in AZ. His commitment to immediate improvement and a unique feedback-driven practice approach sets him apart. What advanced technologies are used in EJS Golf's Scottsdale Golf Lessons? EJS Golf Academy is an elite facility that boasts the best equipment to make golfers better in the area and also for online golf lessons. I use cutting-edge technologies like the Trackman 4 Launch Monitor, 3D video analysis, 3D Dual Foce Plates, wrist sensors by HackMotion and much more. These tools allow us to provide precise, data-driven feedback to enhance your learning experience and rapidly improve your skills. Book Your Intro Lesson Now EJS Golf Lessons Adult 2 Hour $500 Introductory Lesson 120 Mins Total Amount $ 500 Every first-time student at EJS Golf Academy begins with a mandatory two-hour introductory lesson, and for good reason. This isn’t just an introduction; it’s a deep dive into the core of what makes you a golfer and where you have the potential to improve. In these two hours, I’ll take you through every fundamental detail that impacts your game—grip, posture, alignment, and beyond. Using tools like Trackman 4, GRF Analysis, 3D Video, and Hackmotion, I’ll analyze your unique swing mechanics and ground reaction forces, providing you with a thorough, science-backed assessment of your current abilities and areas for growth. Together, we’ll set a solid foundation for your development, creating a blueprint tailored specifically to you. This session is packed with insights that most golfers would only gain over multiple lessons elsewhere. I’ll make sure you understand exactly what needs work and why, giving you a clear path forward that you can start implementing right away. Plus, you’ll walk away with a customized practice plan designed to get you results fast. My goal is to provide you with not just answers, but a full understanding of how to use your strengths to become a better, more consistent ball-striker. You will also receive a recap of our lesson and drills to practice within 48 hours of our lesson. Select Date &amp; Time March January February March April May June July August September October November December 2026 1986 1987 1988 1989 1990 1991 1992 1993 1994 1995 1996 1997 1998 1999 2000 2001 2002 2003 2004 2005 2006 2007 2008 2009 2010 2011 2012 2013 2014 2015 2016 2017 2018 2019 2020 2021 2022 2023 2024 2025 2026 2027 2028 2029 2030 2031 2032 2033 2034 2035 2036 2037 2038 2039 2040 2041 2042 2043 2044 2045 2046 2047 2048 2049 2050 2051 2052 2053 2054 2055 2056 2057 2058 2059 2060 2061 2062 2063 2064 2065 2066 Sun Mon Tue Wed Thu Fri Sat 22 23 24 25 26 27 28 1 2 3 4 5 6 7 8 9 10 11 12 13 14 15 16 17 18 19 20 21 22 23 24 25 26 27 28 29 30 31 1 2 3 4 Time zone GMT+05:30 Asia/Calcutta (GMT+5:30) GMT-12:00 Etc/GMT+12 (GMT-12) 06:55 AM GMT-11:00 Pacific/Midway (GMT-11) 07:55 AM GMT-10:00 Pacific/Honolulu (HST) 08:55 AM GMT-08:00 America/Juneau (AKDT) 10:55 AM GMT-08:00 US/Alaska (AKDT) 10:55 AM GMT-07:00 America/Dawson (GMT-7) 11:55 AM GMT-07:00 America/Los_Angeles (PDT) 11:55 AM GMT-07:00 America/Phoenix (MST) 11:55 AM GMT-07:00 America/Tijuana (PDT) 11:55 AM GMT-07:00 US/Arizona (MST) 11:55 AM GMT-06:00 America/Belize (CST) 12:55 PM GMT-06:00 America/Boise (MDT) 12:55 PM GMT-06:00 America/Chihuahua (CST) 12:55 PM GMT-06:00 America/Denver (MDT) 12:55 PM GMT-06:00 America/Edmonton (MDT) 12:55 PM GMT-06:00 America/Guatemala (CST) 12:55 PM GMT-06:00 America/Managua (CST) 12:55 PM GMT-06:00 America/Regina (CST) 12:55 PM GMT-06:00 Canada/Saskatchewan (CST) 12:55 PM GMT-06:00 US/Mountain (MDT) 12:55 PM GMT-06:00 America/Bahia_Banderas (CST) 12:55 PM GMT-06:00 America/Mexico_City (CST) 12:55 PM GMT-05:00 America/Bogota (GMT-5) 01:55 PM GMT-05:00 America/Cancun (EST) 01:55 PM GMT-05:00 America/Chicago (CDT) 01:55 PM GMT-05:00 US/Central (CDT) 01:55 PM GMT-04:00 America/Caracas (GMT-4) 02:55 PM GMT-04:00 America/Detroit (EDT) 02:55 PM GMT-04:00 America/Indiana/Indianapolis (EDT) 02:55 PM GMT-04:00 America/Louisville (EDT) 02:55 PM GMT-04:00 America/Manaus (GMT-4) 02:55 PM GMT-04:00 America/New_York (EDT) 02:55 PM GMT-04:00 America/Santo_Domingo (AST) 02:55 PM GMT-04:00 America/Toronto (EDT) 02:55 PM GMT-04:00 US/East-Indiana (EDT) 02:55 PM GMT-04:00 US/Eastern (EDT) 02:55 PM GMT-03:00 America/Santiago (GMT-3) 03:55 PM GMT-03:00 America/Argentina/Buenos_Aires (GMT-3) 03:55 PM GMT-03:00 America/Glace_Bay (ADT) 03:55 PM GMT-03:00 America/Montevideo (GMT-3) 03:55 PM GMT-03:00 America/Sao_Paulo (GMT-3) 03:55 PM GMT-03:00 Canada/Atlantic (ADT) 03:55 PM GMT-02:30 America/St_Johns (GMT-2:30) 04:25 PM GMT-02:30 Canada/Newfoundland (GMT-2:30) 04:25 PM GMT-02:00 America/Godthab (GMT-2) 04:55 PM GMT-02:00 America/Noronha (GMT-2) 04:55 PM GMT-02:00 Etc/GMT+2 (GMT-2) 04:55 PM GMT-01:00 Atlantic/Cape_Verde (GMT-1) 05:55 PM GMT-01:00 Atlantic/Azores (GMT-1) 05:55 PM GMT+00:00 UTC (UTC) 06:55 PM GMT+00:00 Atlantic/Canary (GMT) 06:55 PM GMT+00:00 Europe/London (GMT) 06:55 PM GMT+01:00 Africa/Algiers (GMT+1) 07:55 PM GMT+01:00 Africa/Casablanca (GMT+1) 07:55 PM GMT+01:00 Africa/Lagos (GMT+1) 07:55 PM GMT+01:00 Europe/Amsterdam (GMT+1) 07:55 PM GMT+01:00 Europe/Belgrade (GMT+1) 07:55 PM GMT+01:00 Europe/Brussels (GMT+1) 07:55 PM GMT+01:00 Europe/Madrid (GMT+1) 07:55 PM GMT+01:00 Europe/Oslo (GMT+1) 07:55 PM GMT+01:00 Europe/Sarajevo (GMT+1) 07:55 PM GMT+01:00 Europe/Paris (GMT+1) 07:55 PM GMT+02:00 Africa/Cairo (GMT+2) 08:55 PM GMT+02:00 Africa/Harare (GMT+2) 08:55 PM GMT+02:00 Asia/Beirut (GMT+2) 08:55 PM GMT+02:00 Europe/Athens (GMT+2) 08:55 PM GMT+02:00 Europe/Bucharest (GMT+2) 08:55 PM GMT+02:00 Europe/Helsinki (GMT+2) 08:55 PM GMT+03:00 Africa/Nairobi (GMT+3) 09:55 PM GMT+03:00 Asia/Amman (GMT+3) 09:55 PM GMT+03:00 Asia/Baghdad (GMT+3) 09:55 PM GMT+03:00 Asia/Jerusalem (GMT+3) 09:55 PM GMT+03:00 Asia/Kuwait (GMT+3) 09:55 PM GMT+03:00 Asia/Qatar (GMT+3) 09:55 PM GMT+03:00 Europe/Moscow (GMT+3) 09:55 PM GMT+03:00 Turkey (GMT+3) 09:55 PM GMT+03:30 Asia/Tehran (GMT+3:30) 10:25 PM GMT+04:00 Asia/Baku (GMT+4) 10:55 PM GMT+04:00 Asia/Dubai (GMT+4) 10:55 PM GMT+04:30 Asia/Kabul (GMT+4:30) 11:25 PM GMT+05:00 Asia/Karachi (GMT+5) 11:55 PM GMT+05:00 Asia/Yekaterinburg (GMT+5) 11:55 PM GMT+05:00 Asia/Almaty (GMT+5) 11:55 PM GMT+05:30 Asia/Colombo (GMT+5:30) 12:25 AM GMT+05:30 Asia/Kolkata (GMT+5:30) 12:25 AM GMT+05:30 Asia/Calcutta (GMT+5:30) 12:25 AM GMT+05:45 Asia/Kathmandu (GMT+5:45) 12:40 AM GMT+06:00 Asia/Dhaka (GMT+6) 12:55 AM GMT+06:30 Asia/Rangoon (GMT+6:30) 01:25 AM GMT+07:00 Asia/Bangkok (GMT+7) 01:55 AM GMT+07:00 Asia/Krasnoyarsk (GMT+7) 01:55 AM GMT+08:00 Asia/Irkutsk (GMT+8) 02:55 AM GMT+08:00 Asia/Kuala_Lumpur (GMT+8) 02:55 AM GMT+08:00 Asia/Shanghai (GMT+8) 02:55 AM GMT+08:00 Asia/Taipei (GMT+8) 02:55 AM GMT+08:00 Australia/Perth (GMT+8) 02:55 AM GMT+09:00 Asia/Seoul (GMT+9) 03:55 AM GMT+09:00 Asia/Tokyo (GMT+9) 03:55 AM GMT+09:00 Asia/Yakutsk (GMT+9) 03:55 AM GMT+09:30 Australia/Darwin (GMT+9:30) 04:25 AM GMT+10:00 Asia/Vladivostok (GMT+10) 04:55 AM GMT+10:00 Australia/Brisbane (GMT+10) 04:55 AM GMT+10:00 Pacific/Guam (GMT+10) 04:55 AM GMT+10:30 Australia/Adelaide (GMT+10:30) 05:25 AM GMT+11:00 Australia/Canberra (GMT+11) 05:55 AM GMT+11:00 Australia/Hobart (GMT+11) 05:55 AM GMT+11:00 Australia/Sydney (GMT+11) 05:55 AM GMT+11:00 Asia/Magadan (GMT+11) 05:55 AM GMT+12:00 Pacific/Fiji (GMT+12) 06:55 AM GMT+13:00 Pacific/Auckland (GMT+13) 07:55 AM GMT+13:00 Pacific/Tongatapu (GMT+13) 07:55 AM No Timezone found! List is empty. “Erik is one of the most gifted coaches I know, he is blessed with the most important attributes that make a great coach - knowledge, understanding, communication and ambition to learn. I wouldn’t hesitate to recommend working with Erik to develop your game” - Hugh Marr, European Tour Coach Scottsdale Golf League for Women A 9-hole golf league for women supporting players of all levels and abilities. We hsot several rounds per month at McCormick Ranch Golf Club. Membership includes many other benefits including discounts on group and individual lessons as well as free webinars and membership in our Duos League. Learn More Scottsdale Duos Golf League A casual, coed league offering monthly events at various local golf courses for golfers looking to meet other golfers in a relaxed environment. Optional ocial events are available after each round. Learn More Ready To Transform Your Game? Set up some time for us to chat. We'll talk about your goals and answer any questions you have to find the best solution for you! Book Intro Now I've taken multiple private lessons with Erik and he's been by far the best swing coach I have ever worked with. He has the ability to dissect your swing and make small changes for big improvements. What I love most about his lessons is they go far beyond the 1 or 2 hours you're with him. He follows up with videos of how you can improve at home and on the range. The value he provides is absolutely worth the cost of his sessions. I would recommend any golfer at any level who truly wants to get better to go see Erik.” - Reanol H. Erik is the best! and that is not an exaggeration. There has not been a single lesson where I haven't walked out and felt like a far better golfer than before. What can't be praised enough is the effort and dedication that Eric puts into each of his students, as his approach to fixing and improving my golf swing was specific to me. While teaching, Erik takes the extra time to truly dive into what he is trying to convey rather than just telling you, allowing for a better understanding. Beyond the instruction at the course, Erik sends specific drills to you from an app that allows for slow motion replays, letting you break down everything and work on your game at any time. I genuinely mean it when I say that I would recommend Erik to anyone wanting to improve their golf game, as he is not only a top not instructor but also a top notch person who cares about his students. - Brennan K. Erik is flat out a great coach and mentor! I highly recommend him! Working from the ground up, my swing is healthier and smooth! I wanted a coach that shared the same main principles as the late Tony Manzoni and Erik hits the mark! Found Erik by listening to the Golf Smarter podcast by Fred Greene and connected with EJS Golf through the Perfect Motion app. Erik is motivated and incredibly gifted at his craft! - Bryan B., Indiana, USA Location Address : 7505 E McCormick Pkwy EJS Golf Academy is located at McCormick Ranch G. C. in Scottsdale, AZ. Private golf  lessons away from public. LEAVE A REVIEW Click the logos below to leave a review for EJS Golf. © 2024 EJS Golf Email: erik@ejsgolf.com Phone : (480) 861-9370 Address : 7505 E McCormick Pkwy</w:t>
       </w:r>
     </w:p>
     <w:sectPr>

</xml_diff>

<commit_message>
Update niche prompt: add 100 coach-based ecosystems, remove old skill-based niches
</commit_message>
<xml_diff>
--- a/output/websites.docx
+++ b/output/websites.docx
@@ -15,12 +15,12 @@
         <w:pStyle w:val="Heading2"/>
       </w:pPr>
       <w:r>
-        <w:t>EJS Golf</w:t>
+        <w:t>Joy Fahey Website</w:t>
       </w:r>
     </w:p>
     <w:p>
       <w:r>
-        <w:t>URL: https://ejsgolf.com/</w:t>
+        <w:t>URL: https://joyfahey.com/</w:t>
       </w:r>
     </w:p>
     <w:p>
@@ -35,7 +35,15 @@
     </w:p>
     <w:p>
       <w:r>
-        <w:t>Scottsdale Golf Lessons | Data-Driven Golf Instruction | EJS Golf Scottsdale Golf Lessons | Data-Driven Golf Instruction | EJS Golf Golf Lessons Scottsdale Golf Lessons Online Golf Lessons Free Phone Consultation About SBG Community Blog More Contact Me Gear 15 - Minutes Practice Guide Gift Certificates Technology Swingyard.com Book Intro Lesson Elevate Your Golf Game In 2026 Scottsdale's #1 Rated Golf Instructor Book Intro Lesson Scottsdale Golf Lessons Schedule a golf lesson with Coach Erik at his teaching bay at the back of the range at McCormick Ranch Golf Club. Coach Erik offers individual, partner, group, junior, and playing lessons. Learn More Scottsdale Golf Lessons Schedule a golf lesson with Coach Erik at his teaching bay at the back of the range at McCormick Ranch Golf Club. Coach Erik offers individual, partner, group, junior, and playing lessons. Learn More Online Lessons If you don't live in Scottsdale, AZ or don't have availability during daylight hours for a lesson in person, online lessons are a good fit for you. We're no longer limited by distance. Learn More Online Lessons If you don't live in Scottsdale, AZ or don't have availability during daylight hours for a lesson in person, online lessons are a good fit for you. We're no longer limited by distance. Learn More EJS GOLF - GET BETTER NOW Why Choose Coach Erik? Rapid Improvement Philosophy Get Better From Day One Experience and Expertise Focus On Biomechanics and Learning Accessibility and Flexibility Customized Feedback-Driven Approach BOOK INTRO NOW Listen to one student's experience with Coach Erik... PREMIUM GOLF INSTRUCTION MAKING YOU A BETTER GOLFER! "My goal for every golfer is to eventually have them become their own best golf coach. Imagine being in control of your swing faults, ball flight issues, and how to fix them!" -Erik Schjolberg, EJS Golf Academy Phone: 480.861.9370 Email: erik@ejsgolf.com WHAT STUDENTS ARE SAYING... #1 Rated Coach by Golfers Who... Play Competitively EJS Golf Academy in Scottsdale is the go-to place for competitive golfers aiming for the top. My elite coaching with Scottsdale Golf Lessons , caters to juniors, collegiate athletes, and professionals. I focus on getting each golfer to the next level they want to achieve. I work with the parents of juniors and college golfers to get everyone on the same page so that the same message is used all the time. There is no greater honor for me than helping a junior into the college of their dreams. Offering both Golf Lessons Scottsdale and Online Golf Lessons , I provide the tools and training necessary for you to excel in competitive golf . Reached a Plateau Do you feel stuck ? Still hitting golf shots you don't like ? For golfers experiencing a plateau, you are ready for my breakthrough solutions . My Scottsdale Golf Lessons and o nline golf lessons are tailored to identify and overcome your specific challenges. I want to give you the tools you need to move past your plateau . Using advanced techniques and tools like the Trackman 4, Dual 3D Pressure Plates, 3D Video and much more I provide targeted coaching to refine your skills. We'll work together to get you through the challenges you are facing. A High Handicap At EJS Golf in Scottsdale AZ, coach Erik specializes in transforming high handicappers into confident golfers that shoot much lower scores. Coach Erik focuses on building consistency into your game by teaching you how to consistently strike the golf ball first. This means no more topped golf shots, no more fat golf shots. With my state-of-the-art technology and personalized approach, I ensure that every golfer that comes to see me improves. YOU DO NOT NEED TO GET WORSE BEFORE YOU GET BETTER! FAQS What Sets EJS Golf Apart in Offering Scottsdale Golf Lessons? EJS Golf Academy, located at McCormick Ranch Golf Club in Scottsdale, AZ , is renowned for its ability to make golfers better from day one. Led by Coach Erik, a seasoned instructor with PGA Tour coaching experience, guarantees your results. How do EJS Golf's Online Golf Lessons differ from traditional coaching? Online Golf Lessons with Coach Erik of EJS Golf allows golfers from all over the world to work with Scottsdale's Top golf coach. Using the latest tech, including 3D mapping, be like Matt R. and drop your handicap from 15 to a 6 in one year. Find out what PGA Tour Professionals know about coach Erik wherever you are. Are the Golf Lessons Near Me at EJS Golf Suitable for all Skill Levels? Absolutely! Whether you're a beginner or an advanced player, EJS Golf provides lessons tailored to your skill level. My approach is rooted in biomechanics and modern teaching techniques, making us the no. 1 choice for golfers seeking the best golf instruction in AZ. Why is Coach Erik Considered Among the Best Golf Instructors in AZ? Coach Erik's extensive experience, including over 25 years of professional golf coaching, PGA Tour player mentoring, voted no. 1 by those that take golf lessons in Scottsdale and online golf lessons position him as one of the best golf instructors in AZ. His commitment to immediate improvement and a unique feedback-driven practice approach sets him apart. What advanced technologies are used in EJS Golf's Scottsdale Golf Lessons? EJS Golf Academy is an elite facility that boasts the best equipment to make golfers better in the area and also for online golf lessons. I use cutting-edge technologies like the Trackman 4 Launch Monitor, 3D video analysis, 3D Dual Foce Plates, wrist sensors by HackMotion and much more. These tools allow us to provide precise, data-driven feedback to enhance your learning experience and rapidly improve your skills. Book Your Intro Lesson Now EJS Golf Lessons Adult 2 Hour $500 Introductory Lesson 120 Mins Total Amount $ 500 Every first-time student at EJS Golf Academy begins with a mandatory two-hour introductory lesson, and for good reason. This isn’t just an introduction; it’s a deep dive into the core of what makes you a golfer and where you have the potential to improve. In these two hours, I’ll take you through every fundamental detail that impacts your game—grip, posture, alignment, and beyond. Using tools like Trackman 4, GRF Analysis, 3D Video, and Hackmotion, I’ll analyze your unique swing mechanics and ground reaction forces, providing you with a thorough, science-backed assessment of your current abilities and areas for growth. Together, we’ll set a solid foundation for your development, creating a blueprint tailored specifically to you. This session is packed with insights that most golfers would only gain over multiple lessons elsewhere. I’ll make sure you understand exactly what needs work and why, giving you a clear path forward that you can start implementing right away. Plus, you’ll walk away with a customized practice plan designed to get you results fast. My goal is to provide you with not just answers, but a full understanding of how to use your strengths to become a better, more consistent ball-striker. You will also receive a recap of our lesson and drills to practice within 48 hours of our lesson. Select Date &amp; Time March January February March April May June July August September October November December 2026 1986 1987 1988 1989 1990 1991 1992 1993 1994 1995 1996 1997 1998 1999 2000 2001 2002 2003 2004 2005 2006 2007 2008 2009 2010 2011 2012 2013 2014 2015 2016 2017 2018 2019 2020 2021 2022 2023 2024 2025 2026 2027 2028 2029 2030 2031 2032 2033 2034 2035 2036 2037 2038 2039 2040 2041 2042 2043 2044 2045 2046 2047 2048 2049 2050 2051 2052 2053 2054 2055 2056 2057 2058 2059 2060 2061 2062 2063 2064 2065 2066 Sun Mon Tue Wed Thu Fri Sat 22 23 24 25 26 27 28 1 2 3 4 5 6 7 8 9 10 11 12 13 14 15 16 17 18 19 20 21 22 23 24 25 26 27 28 29 30 31 1 2 3 4 Time zone GMT+05:30 Asia/Calcutta (GMT+5:30) GMT-12:00 Etc/GMT+12 (GMT-12) 06:55 AM GMT-11:00 Pacific/Midway (GMT-11) 07:55 AM GMT-10:00 Pacific/Honolulu (HST) 08:55 AM GMT-08:00 America/Juneau (AKDT) 10:55 AM GMT-08:00 US/Alaska (AKDT) 10:55 AM GMT-07:00 America/Dawson (GMT-7) 11:55 AM GMT-07:00 America/Los_Angeles (PDT) 11:55 AM GMT-07:00 America/Phoenix (MST) 11:55 AM GMT-07:00 America/Tijuana (PDT) 11:55 AM GMT-07:00 US/Arizona (MST) 11:55 AM GMT-06:00 America/Belize (CST) 12:55 PM GMT-06:00 America/Boise (MDT) 12:55 PM GMT-06:00 America/Chihuahua (CST) 12:55 PM GMT-06:00 America/Denver (MDT) 12:55 PM GMT-06:00 America/Edmonton (MDT) 12:55 PM GMT-06:00 America/Guatemala (CST) 12:55 PM GMT-06:00 America/Managua (CST) 12:55 PM GMT-06:00 America/Regina (CST) 12:55 PM GMT-06:00 Canada/Saskatchewan (CST) 12:55 PM GMT-06:00 US/Mountain (MDT) 12:55 PM GMT-06:00 America/Bahia_Banderas (CST) 12:55 PM GMT-06:00 America/Mexico_City (CST) 12:55 PM GMT-05:00 America/Bogota (GMT-5) 01:55 PM GMT-05:00 America/Cancun (EST) 01:55 PM GMT-05:00 America/Chicago (CDT) 01:55 PM GMT-05:00 US/Central (CDT) 01:55 PM GMT-04:00 America/Caracas (GMT-4) 02:55 PM GMT-04:00 America/Detroit (EDT) 02:55 PM GMT-04:00 America/Indiana/Indianapolis (EDT) 02:55 PM GMT-04:00 America/Louisville (EDT) 02:55 PM GMT-04:00 America/Manaus (GMT-4) 02:55 PM GMT-04:00 America/New_York (EDT) 02:55 PM GMT-04:00 America/Santo_Domingo (AST) 02:55 PM GMT-04:00 America/Toronto (EDT) 02:55 PM GMT-04:00 US/East-Indiana (EDT) 02:55 PM GMT-04:00 US/Eastern (EDT) 02:55 PM GMT-03:00 America/Santiago (GMT-3) 03:55 PM GMT-03:00 America/Argentina/Buenos_Aires (GMT-3) 03:55 PM GMT-03:00 America/Glace_Bay (ADT) 03:55 PM GMT-03:00 America/Montevideo (GMT-3) 03:55 PM GMT-03:00 America/Sao_Paulo (GMT-3) 03:55 PM GMT-03:00 Canada/Atlantic (ADT) 03:55 PM GMT-02:30 America/St_Johns (GMT-2:30) 04:25 PM GMT-02:30 Canada/Newfoundland (GMT-2:30) 04:25 PM GMT-02:00 America/Godthab (GMT-2) 04:55 PM GMT-02:00 America/Noronha (GMT-2) 04:55 PM GMT-02:00 Etc/GMT+2 (GMT-2) 04:55 PM GMT-01:00 Atlantic/Cape_Verde (GMT-1) 05:55 PM GMT-01:00 Atlantic/Azores (GMT-1) 05:55 PM GMT+00:00 UTC (UTC) 06:55 PM GMT+00:00 Atlantic/Canary (GMT) 06:55 PM GMT+00:00 Europe/London (GMT) 06:55 PM GMT+01:00 Africa/Algiers (GMT+1) 07:55 PM GMT+01:00 Africa/Casablanca (GMT+1) 07:55 PM GMT+01:00 Africa/Lagos (GMT+1) 07:55 PM GMT+01:00 Europe/Amsterdam (GMT+1) 07:55 PM GMT+01:00 Europe/Belgrade (GMT+1) 07:55 PM GMT+01:00 Europe/Brussels (GMT+1) 07:55 PM GMT+01:00 Europe/Madrid (GMT+1) 07:55 PM GMT+01:00 Europe/Oslo (GMT+1) 07:55 PM GMT+01:00 Europe/Sarajevo (GMT+1) 07:55 PM GMT+01:00 Europe/Paris (GMT+1) 07:55 PM GMT+02:00 Africa/Cairo (GMT+2) 08:55 PM GMT+02:00 Africa/Harare (GMT+2) 08:55 PM GMT+02:00 Asia/Beirut (GMT+2) 08:55 PM GMT+02:00 Europe/Athens (GMT+2) 08:55 PM GMT+02:00 Europe/Bucharest (GMT+2) 08:55 PM GMT+02:00 Europe/Helsinki (GMT+2) 08:55 PM GMT+03:00 Africa/Nairobi (GMT+3) 09:55 PM GMT+03:00 Asia/Amman (GMT+3) 09:55 PM GMT+03:00 Asia/Baghdad (GMT+3) 09:55 PM GMT+03:00 Asia/Jerusalem (GMT+3) 09:55 PM GMT+03:00 Asia/Kuwait (GMT+3) 09:55 PM GMT+03:00 Asia/Qatar (GMT+3) 09:55 PM GMT+03:00 Europe/Moscow (GMT+3) 09:55 PM GMT+03:00 Turkey (GMT+3) 09:55 PM GMT+03:30 Asia/Tehran (GMT+3:30) 10:25 PM GMT+04:00 Asia/Baku (GMT+4) 10:55 PM GMT+04:00 Asia/Dubai (GMT+4) 10:55 PM GMT+04:30 Asia/Kabul (GMT+4:30) 11:25 PM GMT+05:00 Asia/Karachi (GMT+5) 11:55 PM GMT+05:00 Asia/Yekaterinburg (GMT+5) 11:55 PM GMT+05:00 Asia/Almaty (GMT+5) 11:55 PM GMT+05:30 Asia/Colombo (GMT+5:30) 12:25 AM GMT+05:30 Asia/Kolkata (GMT+5:30) 12:25 AM GMT+05:30 Asia/Calcutta (GMT+5:30) 12:25 AM GMT+05:45 Asia/Kathmandu (GMT+5:45) 12:40 AM GMT+06:00 Asia/Dhaka (GMT+6) 12:55 AM GMT+06:30 Asia/Rangoon (GMT+6:30) 01:25 AM GMT+07:00 Asia/Bangkok (GMT+7) 01:55 AM GMT+07:00 Asia/Krasnoyarsk (GMT+7) 01:55 AM GMT+08:00 Asia/Irkutsk (GMT+8) 02:55 AM GMT+08:00 Asia/Kuala_Lumpur (GMT+8) 02:55 AM GMT+08:00 Asia/Shanghai (GMT+8) 02:55 AM GMT+08:00 Asia/Taipei (GMT+8) 02:55 AM GMT+08:00 Australia/Perth (GMT+8) 02:55 AM GMT+09:00 Asia/Seoul (GMT+9) 03:55 AM GMT+09:00 Asia/Tokyo (GMT+9) 03:55 AM GMT+09:00 Asia/Yakutsk (GMT+9) 03:55 AM GMT+09:30 Australia/Darwin (GMT+9:30) 04:25 AM GMT+10:00 Asia/Vladivostok (GMT+10) 04:55 AM GMT+10:00 Australia/Brisbane (GMT+10) 04:55 AM GMT+10:00 Pacific/Guam (GMT+10) 04:55 AM GMT+10:30 Australia/Adelaide (GMT+10:30) 05:25 AM GMT+11:00 Australia/Canberra (GMT+11) 05:55 AM GMT+11:00 Australia/Hobart (GMT+11) 05:55 AM GMT+11:00 Australia/Sydney (GMT+11) 05:55 AM GMT+11:00 Asia/Magadan (GMT+11) 05:55 AM GMT+12:00 Pacific/Fiji (GMT+12) 06:55 AM GMT+13:00 Pacific/Auckland (GMT+13) 07:55 AM GMT+13:00 Pacific/Tongatapu (GMT+13) 07:55 AM No Timezone found! List is empty. “Erik is one of the most gifted coaches I know, he is blessed with the most important attributes that make a great coach - knowledge, understanding, communication and ambition to learn. I wouldn’t hesitate to recommend working with Erik to develop your game” - Hugh Marr, European Tour Coach Scottsdale Golf League for Women A 9-hole golf league for women supporting players of all levels and abilities. We hsot several rounds per month at McCormick Ranch Golf Club. Membership includes many other benefits including discounts on group and individual lessons as well as free webinars and membership in our Duos League. Learn More Scottsdale Duos Golf League A casual, coed league offering monthly events at various local golf courses for golfers looking to meet other golfers in a relaxed environment. Optional ocial events are available after each round. Learn More Ready To Transform Your Game? Set up some time for us to chat. We'll talk about your goals and answer any questions you have to find the best solution for you! Book Intro Now I've taken multiple private lessons with Erik and he's been by far the best swing coach I have ever worked with. He has the ability to dissect your swing and make small changes for big improvements. What I love most about his lessons is they go far beyond the 1 or 2 hours you're with him. He follows up with videos of how you can improve at home and on the range. The value he provides is absolutely worth the cost of his sessions. I would recommend any golfer at any level who truly wants to get better to go see Erik.” - Reanol H. Erik is the best! and that is not an exaggeration. There has not been a single lesson where I haven't walked out and felt like a far better golfer than before. What can't be praised enough is the effort and dedication that Eric puts into each of his students, as his approach to fixing and improving my golf swing was specific to me. While teaching, Erik takes the extra time to truly dive into what he is trying to convey rather than just telling you, allowing for a better understanding. Beyond the instruction at the course, Erik sends specific drills to you from an app that allows for slow motion replays, letting you break down everything and work on your game at any time. I genuinely mean it when I say that I would recommend Erik to anyone wanting to improve their golf game, as he is not only a top not instructor but also a top notch person who cares about his students. - Brennan K. Erik is flat out a great coach and mentor! I highly recommend him! Working from the ground up, my swing is healthier and smooth! I wanted a coach that shared the same main principles as the late Tony Manzoni and Erik hits the mark! Found Erik by listening to the Golf Smarter podcast by Fred Greene and connected with EJS Golf through the Perfect Motion app. Erik is motivated and incredibly gifted at his craft! - Bryan B., Indiana, USA Location Address : 7505 E McCormick Pkwy EJS Golf Academy is located at McCormick Ranch G. C. in Scottsdale, AZ. Private golf  lessons away from public. LEAVE A REVIEW Click the logos below to leave a review for EJS Golf. © 2024 EJS Golf Email: erik@ejsgolf.com Phone : (480) 861-9370 Address : 7505 E McCormick Pkwy</w:t>
+        <w:t xml:space="preserve">Joy Fahey - Renowned Artist | Abstract Art &amp; Courses Skip to content Contact About The Heart &amp; Soul Art Academy Free Courses Abstract Painting Free Mini Course Free Taster Course – A Simple Way to Paint Abstracts My Art Gallery 1 Gallery 2 Gallery 3 Gallery 4 Print Store Other Courses Abstract Flowers Masterclass The Complete Abstract Painting Course Art Connection Course YouTube Channel (Art Tutorials) Contact Head Office: Granada, Spain Hours: Monday – Friday 8:30am – 5pm AEST Joy Fahey © All rights reserved 2024 Terms of Service   Privacy Policy About The Heart &amp; Soul Art Academy Free Courses Abstract Painting Free Mini Course Free Taster Course – A Simple Way to Paint Abstracts My Art Gallery 1 Gallery 2 Gallery 3 Gallery 4 Print Store Other Courses Abstract Flowers Masterclass The Complete Abstract Painting Course Art Connection Course YouTube Channel (Art Tutorials) About The Heart &amp; Soul Art Academy Free Courses Abstract Painting Free Mini Course Free Taster Course – A Simple Way to Paint Abstracts My Art Gallery 1 Gallery 2 Gallery 3 Gallery 4 Print Store Other Courses Abstract Flowers Masterclass The Complete Abstract Painting Course Art Connection Course YouTube Channel (Art Tutorials) Contact Contact About The Heart &amp; Soul Art Academy Free Courses Abstract Painting Free Mini Course Free Taster Course – A Simple Way to Paint Abstracts My Art Gallery 1 Gallery 2 Gallery 3 Gallery 4 Print Store Other Courses Abstract Flowers Masterclass The Complete Abstract Painting Course Art Connection Course YouTube Channel (Art Tutorials) Contact Head Office: Granada, Spain Hours: Monday – Friday 8:30am – 5pm AEST Joy Fahey © All rights reserved 2024 Terms of Service   Privacy Policy About The Heart &amp; Soul Art Academy Free Courses Abstract Painting Free Mini Course Free Taster Course – A Simple Way to Paint Abstracts My Art Gallery 1 Gallery 2 Gallery 3 Gallery 4 Print Store Other Courses Abstract Flowers Masterclass The Complete Abstract Painting Course Art Connection Course YouTube Channel (Art Tutorials) About The Heart &amp; Soul Art Academy Free Courses Abstract Painting Free Mini Course Free Taster Course – A Simple Way to Paint Abstracts My Art Gallery 1 Gallery 2 Gallery 3 Gallery 4 Print Store Other Courses Abstract Flowers Masterclass The Complete Abstract Painting Course Art Connection Course YouTube Channel (Art Tutorials) Contact Welcome to Joy Fahey’s Art Inspiring Creativity Worldwide Embrace Your Artistic Journey Renowned Abstract Artist Experience the Magic of Abstract Painting &amp; Discover </w:t>
+        <w:br/>
+        <w:t xml:space="preserve">Your Unique, Intuitive, Creative Self Expression FREE  Taster Course: A Simple Way to Paint Abstracts Coming Soon - Click here to join our waitlist Introducing. . . A New vision for your art A creative sanctuary if you’re ready to paint from the heart The Heart &amp; Soul Art Academy is a calm, nourishing space for artists seeking depth, connection, and a more meaningful creative practice. T he Academy brings together everything you need to develop as a confident artist, clear guidance, structured learning, and a supportive creative space, so you’re never left wondering what to paint, how to paint it, or whether you’re doing it right. Instead of jumping between courses, videos, and ideas, the Academy keeps everything under one roof – helping you stay focused, supported, and moving forward at your own pace. Inside the Academy you will find: 📚 14 In-Depth Masterclasses + 100+ Video Lessons A comprehensive learning library covering skills, techniques, and creative approaches — available anytime, at your own pace. ✨ The Artist’s Diary Ongoing guidance, with Prompts, ideas, and encouragement to help you stay motivated and inspired. 🎨 Heart &amp; Soul Art Lessons Intuitive painting monthly lessons that help you tap into your creativity while developing confidence in your own style. 🤍 A Private, Supportive Artist Community – Our Circle A friendly, non-judgemental space to share your work, ask questions, make new friends and feel supported. 🎥 Live Creative Meet-Ups Optional live sessions with me, to ask questions, gain clarity, and feel connected. Try it out for  30 days FREE! Yes ! we´re offering you a month access 100% free Mission Helping artists break free from limitations and </w:t>
+        <w:br/>
+        <w:t xml:space="preserve">discover the transformative power of intuitive, </w:t>
+        <w:br/>
+        <w:t xml:space="preserve">creative art. Meet the Artist... Joy Fahey Joy Fahey’s journey into abstract art began with a deep personal connection to creativity and healing. From her roots in Manchester to her life in Southern Spain, she has transformed her passion for painting into a lifelong pursuit. Over the years, she has evolved from a self-taught artist to an inspiring mentor. Her classes and retreats now bring art to life for students worldwide. READ MORE ABOUT JOY FAHEY Create. Explore. Transform. Connecting </w:t>
+        <w:br/>
+        <w:t>Art and Soul Through her art and teaching, Joy Fahey invites students to explore the freedom of abstract expression. Her lessons blend nature, emotion, and personal growth, helping artists discover their own creative voice while deepening their connection to art. Courses Sold 0 + Countries Reached 0 + Members 0 + Followers 0 k+ Joy In The News “I’ve been painting for years but this course exceeded my expectations &amp; I’ve learnt so much. Huge thanks to Joy &amp; her team.” — JoAnn, Michigan Our students love working with us, just read what they have to say! “I bought your course a while back and decided to start it while on holiday. I’m really enjoying this course and I’m so pleased that your explaining how to create individuality and get into abstract art which is something I’ve been interested in exploring for a while now but didn’t know how to but now I DO! Thank you so much Joy !.” Jeannie U.S.A. “I have ‘attended’ a couple of abstract painting classes online and I know that with Joy Fahey, I have not only learned so much more technically than the others combined but also gained a gift from her. That gift was her enthusiasm and passion from her work that comes across so incredibly well. That passion changed my perspective and approach; I see it reflected in my work. Thank you Joy! “ Marty G U.K. “I enjoyed this course. I have taken a lot of abstract painting courses and found that if I’m open to things being taught, that sometimes expands into other ideas, and this course does that and more !  Thank You Joy.” Stephanie F UK Ready to Unleash Elevate Transform Your Creativity? Click here for your FREE 30 day trial of  our Heart &amp; Soul Art Academy today! An abstract artist, creative mentor, and entrepreneur passionate about helping others find their artistic voice. Whether through her art, teaching, or mentorship, Joy Fahey is dedicated to inspiring creativity and personal growth in every individual. JOY FAHEY About Retreat Exclusive Mini Course 4 Week Ultimate Course Community Paintings CONNECT Facebook Instagram Youtube LEGAL Privacy Policy Terms &amp; Conditions Disclaimers © 2024 Joy Fahey Art Limited. All Rights Reserved  Privacy Policy  |  Terms &amp; Conditions Website Designed &amp; Developed By Co Launch</w:t>
       </w:r>
     </w:p>
     <w:sectPr>

</xml_diff>